<commit_message>
updating release report, adding results for generic vehicles
</commit_message>
<xml_diff>
--- a/Documentation/Checklist_Release_VECTO_3.2.0.1005.docx
+++ b/Documentation/Checklist_Release_VECTO_3.2.0.1005.docx
@@ -4990,7 +4990,7 @@
             </w:rPr>
             <w:id w:val="-999029216"/>
             <w14:checkbox>
-              <w14:checked w14:val="0"/>
+              <w14:checked w14:val="1"/>
               <w14:checkedState w14:val="2612" w14:font="MS Gothic"/>
               <w14:uncheckedState w14:val="2610" w14:font="MS Gothic"/>
             </w14:checkbox>
@@ -5012,7 +5012,7 @@
                   <w:rPr>
                     <w:rFonts w:ascii="MS Gothic" w:eastAsia="MS Gothic" w:hAnsi="MS Gothic" w:cs="Arial" w:hint="eastAsia"/>
                   </w:rPr>
-                  <w:t>☐</w:t>
+                  <w:t>☒</w:t>
                 </w:r>
               </w:p>
             </w:tc>
@@ -5052,7 +5052,7 @@
             </w:rPr>
             <w:id w:val="-1286423710"/>
             <w14:checkbox>
-              <w14:checked w14:val="0"/>
+              <w14:checked w14:val="1"/>
               <w14:checkedState w14:val="2612" w14:font="MS Gothic"/>
               <w14:uncheckedState w14:val="2610" w14:font="MS Gothic"/>
             </w14:checkbox>
@@ -5074,7 +5074,7 @@
                   <w:rPr>
                     <w:rFonts w:ascii="MS Gothic" w:eastAsia="MS Gothic" w:hAnsi="MS Gothic" w:cs="Arial" w:hint="eastAsia"/>
                   </w:rPr>
-                  <w:t>☐</w:t>
+                  <w:t>☒</w:t>
                 </w:r>
               </w:p>
             </w:tc>
@@ -5138,7 +5138,7 @@
             </w:rPr>
             <w:id w:val="-1127541570"/>
             <w14:checkbox>
-              <w14:checked w14:val="0"/>
+              <w14:checked w14:val="1"/>
               <w14:checkedState w14:val="2612" w14:font="MS Gothic"/>
               <w14:uncheckedState w14:val="2610" w14:font="MS Gothic"/>
             </w14:checkbox>
@@ -5160,7 +5160,7 @@
                   <w:rPr>
                     <w:rFonts w:ascii="MS Gothic" w:eastAsia="MS Gothic" w:hAnsi="MS Gothic" w:cs="Arial" w:hint="eastAsia"/>
                   </w:rPr>
-                  <w:t>☐</w:t>
+                  <w:t>☒</w:t>
                 </w:r>
               </w:p>
             </w:tc>
@@ -5197,7 +5197,7 @@
             </w:rPr>
             <w:id w:val="-14611377"/>
             <w14:checkbox>
-              <w14:checked w14:val="0"/>
+              <w14:checked w14:val="1"/>
               <w14:checkedState w14:val="2612" w14:font="MS Gothic"/>
               <w14:uncheckedState w14:val="2610" w14:font="MS Gothic"/>
             </w14:checkbox>
@@ -5219,7 +5219,7 @@
                   <w:rPr>
                     <w:rFonts w:ascii="MS Gothic" w:eastAsia="MS Gothic" w:hAnsi="MS Gothic" w:cs="Arial" w:hint="eastAsia"/>
                   </w:rPr>
-                  <w:t>☐</w:t>
+                  <w:t>☒</w:t>
                 </w:r>
               </w:p>
             </w:tc>
@@ -5256,7 +5256,7 @@
             </w:rPr>
             <w:id w:val="1956435620"/>
             <w14:checkbox>
-              <w14:checked w14:val="0"/>
+              <w14:checked w14:val="1"/>
               <w14:checkedState w14:val="2612" w14:font="MS Gothic"/>
               <w14:uncheckedState w14:val="2610" w14:font="MS Gothic"/>
             </w14:checkbox>
@@ -5278,7 +5278,7 @@
                   <w:rPr>
                     <w:rFonts w:ascii="MS Gothic" w:eastAsia="MS Gothic" w:hAnsi="MS Gothic" w:cs="Arial" w:hint="eastAsia"/>
                   </w:rPr>
-                  <w:t>☐</w:t>
+                  <w:t>☒</w:t>
                 </w:r>
               </w:p>
             </w:tc>
@@ -5315,7 +5315,7 @@
             </w:rPr>
             <w:id w:val="-867984556"/>
             <w14:checkbox>
-              <w14:checked w14:val="0"/>
+              <w14:checked w14:val="1"/>
               <w14:checkedState w14:val="2612" w14:font="MS Gothic"/>
               <w14:uncheckedState w14:val="2610" w14:font="MS Gothic"/>
             </w14:checkbox>
@@ -5337,7 +5337,7 @@
                   <w:rPr>
                     <w:rFonts w:ascii="MS Gothic" w:eastAsia="MS Gothic" w:hAnsi="MS Gothic" w:cs="Arial" w:hint="eastAsia"/>
                   </w:rPr>
-                  <w:t>☐</w:t>
+                  <w:t>☒</w:t>
                 </w:r>
               </w:p>
             </w:tc>
@@ -5374,7 +5374,7 @@
             </w:rPr>
             <w:id w:val="1169446134"/>
             <w14:checkbox>
-              <w14:checked w14:val="0"/>
+              <w14:checked w14:val="1"/>
               <w14:checkedState w14:val="2612" w14:font="MS Gothic"/>
               <w14:uncheckedState w14:val="2610" w14:font="MS Gothic"/>
             </w14:checkbox>
@@ -5396,7 +5396,7 @@
                   <w:rPr>
                     <w:rFonts w:ascii="MS Gothic" w:eastAsia="MS Gothic" w:hAnsi="MS Gothic" w:cs="Arial" w:hint="eastAsia"/>
                   </w:rPr>
-                  <w:t>☐</w:t>
+                  <w:t>☒</w:t>
                 </w:r>
               </w:p>
             </w:tc>
@@ -5493,35 +5493,7 @@
           <w:noProof/>
           <w:sz w:val="24"/>
         </w:rPr>
-        <w:t> </w:t>
-      </w:r>
-      <w:r>
-        <w:rPr>
-          <w:noProof/>
-          <w:sz w:val="24"/>
-        </w:rPr>
-        <w:t> </w:t>
-      </w:r>
-      <w:r>
-        <w:rPr>
-          <w:noProof/>
-          <w:sz w:val="24"/>
-        </w:rPr>
-        <w:t> </w:t>
-      </w:r>
-      <w:r>
-        <w:rPr>
-          <w:noProof/>
-          <w:sz w:val="24"/>
-        </w:rPr>
-        <w:t> </w:t>
-      </w:r>
-      <w:r>
-        <w:rPr>
-          <w:noProof/>
-          <w:sz w:val="24"/>
-        </w:rPr>
-        <w:t> </w:t>
+        <w:t>2.10.2017</w:t>
       </w:r>
       <w:r>
         <w:rPr>
@@ -5588,36 +5560,10 @@
           <w:noProof/>
           <w:sz w:val="24"/>
         </w:rPr>
-        <w:t> </w:t>
+        <w:t>MQ</w:t>
       </w:r>
-      <w:r>
-        <w:rPr>
-          <w:noProof/>
-          <w:sz w:val="24"/>
-        </w:rPr>
-        <w:t> </w:t>
-      </w:r>
-      <w:r>
-        <w:rPr>
-          <w:noProof/>
-          <w:sz w:val="24"/>
-        </w:rPr>
-        <w:t> </w:t>
-      </w:r>
-      <w:r>
-        <w:rPr>
-          <w:noProof/>
-          <w:sz w:val="24"/>
-        </w:rPr>
-        <w:t> </w:t>
-      </w:r>
-      <w:r>
-        <w:rPr>
-          <w:noProof/>
-          <w:sz w:val="24"/>
-        </w:rPr>
-        <w:t> </w:t>
-      </w:r>
+      <w:bookmarkStart w:id="13" w:name="_GoBack"/>
+      <w:bookmarkEnd w:id="13"/>
       <w:r>
         <w:rPr>
           <w:sz w:val="24"/>
@@ -6884,7 +6830,7 @@
 </file>
 
 <file path=customXml/itemProps1.xml><?xml version="1.0" encoding="utf-8"?>
-<ds:datastoreItem xmlns:ds="http://schemas.openxmlformats.org/officeDocument/2006/customXml" ds:itemID="{1499C910-BC24-416F-8CE6-FB866F747951}">
+<ds:datastoreItem xmlns:ds="http://schemas.openxmlformats.org/officeDocument/2006/customXml" ds:itemID="{6CE2AF03-A104-4999-965F-EA7DD59EBF1F}">
   <ds:schemaRefs>
     <ds:schemaRef ds:uri="http://schemas.openxmlformats.org/officeDocument/2006/bibliography"/>
   </ds:schemaRefs>

</xml_diff>